<commit_message>
bookkeeping agreement: add irregularities + employee-dishonesty clause
Adds a second paragraph to Section 14 (Limitation of Liability) of the
signed Word document:

Consultant provides bookkeeping, not audit/fraud investigation; will
flag anything irregular in good faith; internal controls and the
honesty/conduct of Client's employees, officers, and representatives
are solely Client's responsibility; Consultant is not liable for loss
from employee or third-party dishonesty/theft/fraud — including loss
occurring after Consultant has raised a concern about a transaction,
account, or individual; acting on or disregarding such a notice is
Client's decision and Client's consequence.

No names. Matches the fine-print clause now shown in the HTML proposal.
Paragraph count 164 -> 165, clause text verified present in the rebuilt
.docx.

Co-Authored-By: Claude Opus 4.7 (1M context) <noreply@anthropic.com>
</commit_message>
<xml_diff>
--- a/public/proposals/minuteman/Bookkeeping_Services_Agreement_Minuteman.docx
+++ b/public/proposals/minuteman/Bookkeeping_Services_Agreement_Minuteman.docx
@@ -3066,6 +3066,25 @@
           <w:szCs w:val="22"/>
         </w:rPr>
         <w:t xml:space="preserve">Consultant is not responsible for: (a) incomplete or missing records not provided by Client; (b) actions or decisions taken by Client based on Consultant’s deliverables; (c) errors or omissions resulting from inaccurate information provided by Client; or (d) any third-party software outages, data losses, or integration failures outside Consultant’s control. Consultant’s total liability under this Agreement is limited to fees paid by Client in the ninety (90) days immediately preceding any claim.</w:t>
+      </w:r>
+    </w:p>
+    <w:p>
+      <w:pPr>
+        <w:spacing w:after="80" w:before="80" w:line="300"/>
+        <w:jc w:val="left"/>
+      </w:pPr>
+      <w:r>
+        <w:rPr>
+          <w:rFonts w:ascii="Arial" w:cs="Arial" w:eastAsia="Arial" w:hAnsi="Arial"/>
+          <w:b w:val="false"/>
+          <w:bCs w:val="false"/>
+          <w:i w:val="false"/>
+          <w:iCs w:val="false"/>
+          <w:color w:val="1A1A1A"/>
+          <w:sz w:val="22"/>
+          <w:szCs w:val="22"/>
+        </w:rPr>
+        <w:t xml:space="preserve">Consultant provides bookkeeping and financial record-keeping services and does not perform an audit, examination, or fraud investigation. In the ordinary course of its work, Consultant will promptly notify Client of any transaction, balance, or pattern that appears irregular, unusual, or inconsistent. Responsibility for internal controls, for safeguarding assets, and for the honesty and conduct of Client’s employees, officers, and representatives rests solely with Client. Consultant shall not be liable for any loss, shortage, or damage resulting from employee or third-party dishonesty, theft, misappropriation, or fraud, including, without limitation, any such loss occurring after Consultant has advised Client of a concern relating to a transaction, an account, or an individual. The decision to investigate, act upon, or disregard any such notice remains Client’s, and Client assumes the consequences of that decision.</w:t>
       </w:r>
     </w:p>
     <w:p>

</xml_diff>